<commit_message>
added R0 corrected runs and some stats
</commit_message>
<xml_diff>
--- a/16_09 review.docx
+++ b/16_09 review.docx
@@ -4,6 +4,9 @@
   <w:body>
     <w:p>
       <w:r>
+        <w:rPr>
+          <w:noProof/>
+        </w:rPr>
         <w:drawing>
           <wp:inline distT="0" distB="0" distL="0" distR="0" wp14:anchorId="4F23050E" wp14:editId="7A3BAF9F">
             <wp:extent cx="5731510" cy="5513070"/>
@@ -20,7 +23,7 @@
                     <pic:cNvPicPr/>
                   </pic:nvPicPr>
                   <pic:blipFill>
-                    <a:blip r:embed="rId4"/>
+                    <a:blip r:embed="rId5"/>
                     <a:stretch>
                       <a:fillRect/>
                     </a:stretch>
@@ -44,6 +47,9 @@
     <w:p/>
     <w:p>
       <w:r>
+        <w:rPr>
+          <w:noProof/>
+        </w:rPr>
         <w:drawing>
           <wp:inline distT="0" distB="0" distL="0" distR="0" wp14:anchorId="4B63FAB1" wp14:editId="1F59C1D2">
             <wp:extent cx="5731510" cy="2899410"/>
@@ -60,7 +66,7 @@
                     <pic:cNvPicPr/>
                   </pic:nvPicPr>
                   <pic:blipFill>
-                    <a:blip r:embed="rId5"/>
+                    <a:blip r:embed="rId6"/>
                     <a:stretch>
                       <a:fillRect/>
                     </a:stretch>
@@ -83,6 +89,9 @@
     </w:p>
     <w:p>
       <w:r>
+        <w:rPr>
+          <w:noProof/>
+        </w:rPr>
         <w:lastRenderedPageBreak/>
         <w:drawing>
           <wp:inline distT="0" distB="0" distL="0" distR="0" wp14:anchorId="05B53F85" wp14:editId="22BDC764">
@@ -100,7 +109,7 @@
                     <pic:cNvPicPr/>
                   </pic:nvPicPr>
                   <pic:blipFill>
-                    <a:blip r:embed="rId6"/>
+                    <a:blip r:embed="rId7"/>
                     <a:stretch>
                       <a:fillRect/>
                     </a:stretch>
@@ -121,6 +130,9 @@
         </w:drawing>
       </w:r>
       <w:r>
+        <w:rPr>
+          <w:noProof/>
+        </w:rPr>
         <w:drawing>
           <wp:inline distT="0" distB="0" distL="0" distR="0" wp14:anchorId="0EC5D82C" wp14:editId="659AF393">
             <wp:extent cx="5731510" cy="4159250"/>
@@ -137,7 +149,7 @@
                     <pic:cNvPicPr/>
                   </pic:nvPicPr>
                   <pic:blipFill>
-                    <a:blip r:embed="rId7"/>
+                    <a:blip r:embed="rId8"/>
                     <a:stretch>
                       <a:fillRect/>
                     </a:stretch>
@@ -173,6 +185,15 @@
       <w:r>
         <w:t xml:space="preserve"> (this can chang shape as well as mean partners), acts per year and transmission per act (all to lead to beta per partnership this currently sits near 1), singleness- can add a gate, </w:t>
       </w:r>
+      <w:r>
+        <w:t>R0</w:t>
+      </w:r>
+      <w:r>
+        <w:t>, Mean degrees</w:t>
+      </w:r>
+      <w:r>
+        <w:t>, concurrency</w:t>
+      </w:r>
     </w:p>
     <w:p/>
     <w:p/>
@@ -181,6 +202,66 @@
         <w:t xml:space="preserve">Burn in doesn’t work as you would want it to? </w:t>
       </w:r>
     </w:p>
+    <w:p>
+      <w:pPr>
+        <w:pStyle w:val="ListParagraph"/>
+        <w:numPr>
+          <w:ilvl w:val="0"/>
+          <w:numId w:val="1"/>
+        </w:numPr>
+      </w:pPr>
+      <w:r>
+        <w:t>How to measure infection?</w:t>
+      </w:r>
+      <w:r>
+        <w:t xml:space="preserve"> </w:t>
+      </w:r>
+      <w:proofErr w:type="spellStart"/>
+      <w:proofErr w:type="gramStart"/>
+      <w:r>
+        <w:t>Sim.people.</w:t>
+      </w:r>
+      <w:r>
+        <w:t>infections.any</w:t>
+      </w:r>
+      <w:proofErr w:type="spellEnd"/>
+      <w:r>
+        <w:t xml:space="preserve"> ?</w:t>
+      </w:r>
+      <w:proofErr w:type="gramEnd"/>
+    </w:p>
+    <w:p>
+      <w:pPr>
+        <w:pStyle w:val="ListParagraph"/>
+        <w:numPr>
+          <w:ilvl w:val="0"/>
+          <w:numId w:val="1"/>
+        </w:numPr>
+      </w:pPr>
+      <w:r>
+        <w:t xml:space="preserve">Graphs for age structure as well as </w:t>
+      </w:r>
+      <w:r>
+        <w:t>genotypes</w:t>
+      </w:r>
+    </w:p>
+    <w:p>
+      <w:pPr>
+        <w:pStyle w:val="ListParagraph"/>
+        <w:numPr>
+          <w:ilvl w:val="0"/>
+          <w:numId w:val="1"/>
+        </w:numPr>
+      </w:pPr>
+      <w:r>
+        <w:t>Power law at 3.5ish</w:t>
+      </w:r>
+      <w:r>
+        <w:t xml:space="preserve">, singleness over one year, </w:t>
+      </w:r>
+    </w:p>
+    <w:p/>
+    <w:p/>
     <w:sectPr>
       <w:pgSz w:w="11906" w:h="16838"/>
       <w:pgMar w:top="1440" w:right="1440" w:bottom="1440" w:left="1440" w:header="708" w:footer="708" w:gutter="0"/>
@@ -189,6 +270,126 @@
     </w:sectPr>
   </w:body>
 </w:document>
+</file>
+
+<file path=word/numbering.xml><?xml version="1.0" encoding="utf-8"?>
+<w:numbering xmlns:wpc="http://schemas.microsoft.com/office/word/2010/wordprocessingCanvas" xmlns:cx="http://schemas.microsoft.com/office/drawing/2014/chartex" xmlns:cx1="http://schemas.microsoft.com/office/drawing/2015/9/8/chartex" xmlns:cx2="http://schemas.microsoft.com/office/drawing/2015/10/21/chartex" xmlns:cx3="http://schemas.microsoft.com/office/drawing/2016/5/9/chartex" xmlns:cx4="http://schemas.microsoft.com/office/drawing/2016/5/10/chartex" xmlns:cx5="http://schemas.microsoft.com/office/drawing/2016/5/11/chartex" xmlns:cx6="http://schemas.microsoft.com/office/drawing/2016/5/12/chartex" xmlns:cx7="http://schemas.microsoft.com/office/drawing/2016/5/13/chartex" xmlns:cx8="http://schemas.microsoft.com/office/drawing/2016/5/14/chartex" xmlns:mc="http://schemas.openxmlformats.org/markup-compatibility/2006" xmlns:aink="http://schemas.microsoft.com/office/drawing/2016/ink" xmlns:am3d="http://schemas.microsoft.com/office/drawing/2017/model3d" xmlns:o="urn:schemas-microsoft-com:office:office" xmlns:oel="http://schemas.microsoft.com/office/2019/extlst" xmlns:r="http://schemas.openxmlformats.org/officeDocument/2006/relationships" xmlns:m="http://schemas.openxmlformats.org/officeDocument/2006/math" xmlns:v="urn:schemas-microsoft-com:vml" xmlns:wp14="http://schemas.microsoft.com/office/word/2010/wordprocessingDrawing" xmlns:wp="http://schemas.openxmlformats.org/drawingml/2006/wordprocessingDrawing" xmlns:w10="urn:schemas-microsoft-com:office:word" xmlns:w="http://schemas.openxmlformats.org/wordprocessingml/2006/main" xmlns:w14="http://schemas.microsoft.com/office/word/2010/wordml" xmlns:w15="http://schemas.microsoft.com/office/word/2012/wordml" xmlns:w16cex="http://schemas.microsoft.com/office/word/2018/wordml/cex" xmlns:w16cid="http://schemas.microsoft.com/office/word/2016/wordml/cid" xmlns:w16="http://schemas.microsoft.com/office/word/2018/wordml" xmlns:w16du="http://schemas.microsoft.com/office/word/2023/wordml/word16du" xmlns:w16sdtdh="http://schemas.microsoft.com/office/word/2020/wordml/sdtdatahash" xmlns:w16sdtfl="http://schemas.microsoft.com/office/word/2024/wordml/sdtformatlock" xmlns:w16se="http://schemas.microsoft.com/office/word/2015/wordml/symex" xmlns:wpg="http://schemas.microsoft.com/office/word/2010/wordprocessingGroup" xmlns:wpi="http://schemas.microsoft.com/office/word/2010/wordprocessingInk" xmlns:wne="http://schemas.microsoft.com/office/word/2006/wordml" xmlns:wps="http://schemas.microsoft.com/office/word/2010/wordprocessingShape" mc:Ignorable="w14 w15 w16se w16cid w16 w16cex w16sdtdh w16sdtfl w16du wp14">
+  <w:abstractNum w:abstractNumId="0" w15:restartNumberingAfterBreak="0">
+    <w:nsid w:val="490059CE"/>
+    <w:multiLevelType w:val="hybridMultilevel"/>
+    <w:tmpl w:val="2768485A"/>
+    <w:lvl w:ilvl="0" w:tplc="D6D8A5EE">
+      <w:numFmt w:val="bullet"/>
+      <w:lvlText w:val="-"/>
+      <w:lvlJc w:val="left"/>
+      <w:pPr>
+        <w:ind w:left="720" w:hanging="360"/>
+      </w:pPr>
+      <w:rPr>
+        <w:rFonts w:ascii="Aptos" w:eastAsiaTheme="minorEastAsia" w:hAnsi="Aptos" w:cstheme="minorBidi" w:hint="default"/>
+      </w:rPr>
+    </w:lvl>
+    <w:lvl w:ilvl="1" w:tplc="08090003" w:tentative="1">
+      <w:start w:val="1"/>
+      <w:numFmt w:val="bullet"/>
+      <w:lvlText w:val="o"/>
+      <w:lvlJc w:val="left"/>
+      <w:pPr>
+        <w:ind w:left="1440" w:hanging="360"/>
+      </w:pPr>
+      <w:rPr>
+        <w:rFonts w:ascii="Courier New" w:hAnsi="Courier New" w:cs="Courier New" w:hint="default"/>
+      </w:rPr>
+    </w:lvl>
+    <w:lvl w:ilvl="2" w:tplc="08090005" w:tentative="1">
+      <w:start w:val="1"/>
+      <w:numFmt w:val="bullet"/>
+      <w:lvlText w:val=""/>
+      <w:lvlJc w:val="left"/>
+      <w:pPr>
+        <w:ind w:left="2160" w:hanging="360"/>
+      </w:pPr>
+      <w:rPr>
+        <w:rFonts w:ascii="Wingdings" w:hAnsi="Wingdings" w:hint="default"/>
+      </w:rPr>
+    </w:lvl>
+    <w:lvl w:ilvl="3" w:tplc="08090001" w:tentative="1">
+      <w:start w:val="1"/>
+      <w:numFmt w:val="bullet"/>
+      <w:lvlText w:val=""/>
+      <w:lvlJc w:val="left"/>
+      <w:pPr>
+        <w:ind w:left="2880" w:hanging="360"/>
+      </w:pPr>
+      <w:rPr>
+        <w:rFonts w:ascii="Symbol" w:hAnsi="Symbol" w:hint="default"/>
+      </w:rPr>
+    </w:lvl>
+    <w:lvl w:ilvl="4" w:tplc="08090003" w:tentative="1">
+      <w:start w:val="1"/>
+      <w:numFmt w:val="bullet"/>
+      <w:lvlText w:val="o"/>
+      <w:lvlJc w:val="left"/>
+      <w:pPr>
+        <w:ind w:left="3600" w:hanging="360"/>
+      </w:pPr>
+      <w:rPr>
+        <w:rFonts w:ascii="Courier New" w:hAnsi="Courier New" w:cs="Courier New" w:hint="default"/>
+      </w:rPr>
+    </w:lvl>
+    <w:lvl w:ilvl="5" w:tplc="08090005" w:tentative="1">
+      <w:start w:val="1"/>
+      <w:numFmt w:val="bullet"/>
+      <w:lvlText w:val=""/>
+      <w:lvlJc w:val="left"/>
+      <w:pPr>
+        <w:ind w:left="4320" w:hanging="360"/>
+      </w:pPr>
+      <w:rPr>
+        <w:rFonts w:ascii="Wingdings" w:hAnsi="Wingdings" w:hint="default"/>
+      </w:rPr>
+    </w:lvl>
+    <w:lvl w:ilvl="6" w:tplc="08090001" w:tentative="1">
+      <w:start w:val="1"/>
+      <w:numFmt w:val="bullet"/>
+      <w:lvlText w:val=""/>
+      <w:lvlJc w:val="left"/>
+      <w:pPr>
+        <w:ind w:left="5040" w:hanging="360"/>
+      </w:pPr>
+      <w:rPr>
+        <w:rFonts w:ascii="Symbol" w:hAnsi="Symbol" w:hint="default"/>
+      </w:rPr>
+    </w:lvl>
+    <w:lvl w:ilvl="7" w:tplc="08090003" w:tentative="1">
+      <w:start w:val="1"/>
+      <w:numFmt w:val="bullet"/>
+      <w:lvlText w:val="o"/>
+      <w:lvlJc w:val="left"/>
+      <w:pPr>
+        <w:ind w:left="5760" w:hanging="360"/>
+      </w:pPr>
+      <w:rPr>
+        <w:rFonts w:ascii="Courier New" w:hAnsi="Courier New" w:cs="Courier New" w:hint="default"/>
+      </w:rPr>
+    </w:lvl>
+    <w:lvl w:ilvl="8" w:tplc="08090005" w:tentative="1">
+      <w:start w:val="1"/>
+      <w:numFmt w:val="bullet"/>
+      <w:lvlText w:val=""/>
+      <w:lvlJc w:val="left"/>
+      <w:pPr>
+        <w:ind w:left="6480" w:hanging="360"/>
+      </w:pPr>
+      <w:rPr>
+        <w:rFonts w:ascii="Wingdings" w:hAnsi="Wingdings" w:hint="default"/>
+      </w:rPr>
+    </w:lvl>
+  </w:abstractNum>
+  <w:num w:numId="1" w16cid:durableId="660038354">
+    <w:abstractNumId w:val="0"/>
+  </w:num>
+</w:numbering>
 </file>
 
 <file path=word/styles.xml><?xml version="1.0" encoding="utf-8"?>
@@ -794,6 +995,7 @@
   <w:style w:type="character" w:default="1" w:styleId="DefaultParagraphFont">
     <w:name w:val="Default Paragraph Font"/>
     <w:uiPriority w:val="1"/>
+    <w:semiHidden/>
     <w:unhideWhenUsed/>
   </w:style>
   <w:style w:type="table" w:default="1" w:styleId="TableNormal">

</xml_diff>